<commit_message>
Actualiza el reparto en la memoria v1
README (#2) y memoria (#5) pasan a David: se actualizan la tabla de
responsabilidades, la carga de trabajo y las tareas de la entrega 1.

Refs #5

Co-Authored-By: Claude Opus 5.5 <noreply@anthropic.com>
Claude-Session: https://claude.ai/code/session_01To4C82H2U3qP3h6ZVNwjVv
</commit_message>
<xml_diff>
--- a/docs/memoria/Retroconver_Memoria_v1.docx
+++ b/docs/memoria/Retroconver_Memoria_v1.docx
@@ -2211,7 +2211,7 @@
           </w:tcPr>
           <w:p>
             <w:r>
-              <w:t xml:space="preserve">Organización del repositorio, proyecto Android base, navegación, configuración de Room, módulo Perfil y módulo Galería (incluido el reescalado a 720p).</w:t>
+              <w:t xml:space="preserve">Organización del repositorio, planificación, proyecto Android base, navegación, configuración de Room, módulo Perfil y módulo Galería (incluido el reescalado a 720p).</w:t>
             </w:r>
           </w:p>
         </w:tc>
@@ -2259,7 +2259,7 @@
           </w:tcPr>
           <w:p>
             <w:r>
-              <w:t xml:space="preserve">Guía de estilo y tema retro en Compose, bocetos, esquema de datos, módulo Muro (publicaciones y comentarios) y módulo Mensajes.</w:t>
+              <w:t xml:space="preserve">README, memoria, guía de estilo y tema retro en Compose, bocetos, esquema de datos, módulo Muro (publicaciones y comentarios) y módulo Mensajes.</w:t>
             </w:r>
           </w:p>
         </w:tc>
@@ -3287,7 +3287,7 @@
           </w:tcPr>
           <w:p>
             <w:r>
-              <w:t xml:space="preserve">5</w:t>
+              <w:t xml:space="preserve">3</w:t>
             </w:r>
           </w:p>
         </w:tc>
@@ -3309,7 +3309,7 @@
           </w:tcPr>
           <w:p>
             <w:r>
-              <w:t xml:space="preserve">1</w:t>
+              <w:t xml:space="preserve">3</w:t>
             </w:r>
           </w:p>
         </w:tc>
@@ -3643,7 +3643,7 @@
                 <w:b/>
                 <w:bCs/>
               </w:rPr>
-              <w:t xml:space="preserve">16</w:t>
+              <w:t xml:space="preserve">14</w:t>
             </w:r>
           </w:p>
         </w:tc>
@@ -3670,7 +3670,7 @@
                 <w:b/>
                 <w:bCs/>
               </w:rPr>
-              <w:t xml:space="preserve">11</w:t>
+              <w:t xml:space="preserve">13</w:t>
             </w:r>
           </w:p>
         </w:tc>
@@ -3686,7 +3686,7 @@
         <w:spacing w:after="120"/>
       </w:pPr>
       <w:r>
-        <w:t xml:space="preserve">La entrega 1 recae más en Yeray porque prepara la organización del repositorio. A partir de la entrega 2 el reparto se equilibra por módulos.</w:t>
+        <w:t xml:space="preserve">El reparto queda equilibrado: cada integrante tiene un número parecido de tareas en todas las entregas.</w:t>
       </w:r>
     </w:p>
     <w:p>
@@ -3998,7 +3998,7 @@
           </w:tcPr>
           <w:p>
             <w:r>
-              <w:t xml:space="preserve">Yeray</w:t>
+              <w:t xml:space="preserve">David</w:t>
             </w:r>
           </w:p>
         </w:tc>
@@ -4273,7 +4273,7 @@
           </w:tcPr>
           <w:p>
             <w:r>
-              <w:t xml:space="preserve">Yeray</w:t>
+              <w:t xml:space="preserve">David</w:t>
             </w:r>
           </w:p>
         </w:tc>

</xml_diff>